<commit_message>
Add documentary discussion to Week 9 report
Co-Authored-By: Claude Opus 5.5 <noreply@anthropic.com>
Claude-Session: https://claude.ai/code/session_015Pbn36PiRkhzEJDeNyRJtX
</commit_message>
<xml_diff>
--- a/Lagera_Week9.docx
+++ b/Lagera_Week9.docx
@@ -390,7 +390,7 @@
           <w:sz w:val="24"/>
           <w:szCs w:val="24"/>
         </w:rPr>
-        <w:t xml:space="preserve">Users can download their information, delete their account, and see and disconnect activity from other sites. Meta says it doesn't sell personal data. In the U.S., though, you can't fully turn off personalized ads, since ads are how the service is paid for. You can only adjust which topics and data are used. Messenger now uses end-to-end encryption by default, which is a real improvement. Still, Meta's history is hard to ignore. The Cambridge Analytica scandal led to a $5 billion FTC fine in 2019, and in 2023 the EU fined it €1.2 billion for transferring European users' data to the U.S. The policy is also unclear about how long some data is kept after you delete it, and there are ongoing concerns about how it treats teenage users.</w:t>
+        <w:t xml:space="preserve">Users can download their information, delete their account, and see and disconnect activity from other sites. Meta says it doesn't sell personal data. In the U.S., though, you can't fully turn off personalized ads, since ads are how the service is paid for. You can only adjust which topics and data are used. Messenger now uses end-to-end encryption by default, which is a real improvement. Still, Meta's history is hard to ignore. As the documentary we watched explains, Cambridge Analytica collected data from 87 million Facebook users without their permission and used it to target political ads in the 2016 U.S. election. Facebook found out, accepted the firm's word that the data had been deleted, and treated the case as closed, which Mark Zuckerberg later admitted to the Senate was a mistake. The scandal led to a $5 billion FTC fine in 2019, and in 2023 the EU fined it €1.2 billion for transferring European users' data to the U.S. The policy is also unclear about how long some data is kept after you delete it, and there are ongoing concerns about how it treats teenage users.</w:t>
       </w:r>
     </w:p>
     <w:p>
@@ -1923,6 +1923,51 @@
           <w:szCs w:val="18"/>
         </w:rPr>
         <w:t xml:space="preserve">Scores are my own judgment based on each company's privacy policy and privacy settings pages at the time of writing.</w:t>
+      </w:r>
+    </w:p>
+    <w:p>
+      <w:pPr>
+        <w:pStyle w:val="Heading1"/>
+        <w:spacing w:after="160" w:before="240"/>
+      </w:pPr>
+      <w:r>
+        <w:t xml:space="preserve">Connection to the documentary</w:t>
+      </w:r>
+    </w:p>
+    <w:p>
+      <w:pPr>
+        <w:spacing w:after="160" w:line="300"/>
+      </w:pPr>
+      <w:r>
+        <w:rPr>
+          <w:sz w:val="24"/>
+          <w:szCs w:val="24"/>
+        </w:rPr>
+        <w:t xml:space="preserve">The documentary "The Age of Cyber Warfare: The Digital Battlefield" made me look at privacy policies differently. It points out that we don't just go on the Internet anymore, we live in it. We check our phones first thing in the morning and last thing at night, and almost everything we depend on, from banks and transport to water and power, runs on connected systems. One expert in the film says we spent about twenty years building new technology with barely any security or privacy built in, and that regulations still aren't keeping up.</w:t>
+      </w:r>
+    </w:p>
+    <w:p>
+      <w:pPr>
+        <w:spacing w:after="160" w:line="300"/>
+      </w:pPr>
+      <w:r>
+        <w:rPr>
+          <w:sz w:val="24"/>
+          <w:szCs w:val="24"/>
+        </w:rPr>
+        <w:t xml:space="preserve">The film also shows how personal data can be turned into a weapon. Cambridge Analytica is the clearest example, but the documentary also covers fake social media accounts used to spread confusion during the 2016 election. If a company collects huge amounts of data about us, that data can be stolen, misused, or used to manipulate what we believe. That's why the items on my checklist matter so much. Collecting less data, giving users control over it, deleting it after a while, and protecting it with strong security all shrink the amount of information that someone could exploit.</w:t>
+      </w:r>
+    </w:p>
+    <w:p>
+      <w:pPr>
+        <w:spacing w:after="160" w:line="300"/>
+      </w:pPr>
+      <w:r>
+        <w:rPr>
+          <w:sz w:val="24"/>
+          <w:szCs w:val="24"/>
+        </w:rPr>
+        <w:t xml:space="preserve">Another point that stuck with me is that defending a system is much harder than attacking it. An attacker only needs to find one weak spot, while the defender has to protect everything. The examples in the film, like the 2015 attack that cut power to almost a quarter of a million people in Ukraine and the NotPetya ransomware that caused around $10 billion in damage, started with simple tricks like infected email attachments. A website that takes privacy seriously has to take security just as seriously, because a privacy promise means nothing if the data gets stolen.</w:t>
       </w:r>
     </w:p>
     <w:p>

</xml_diff>